<commit_message>
Correct public repository availability statements
Add the verified GitHub URL to the manuscript, README and execution guide; retain private-data and reproducibility restrictions. Refresh the checksum manifest.
</commit_message>
<xml_diff>
--- a/manuscript/Manuscript_V3_complete_M2.docx
+++ b/manuscript/Manuscript_V3_complete_M2.docx
@@ -5338,7 +5338,15 @@
         <w:widowControl/>
       </w:pPr>
       <w:r>
-        <w:t>The accompanying materials contain aggregate results, the updated dictionary, R scripts, and documentation/table_map.csv linking the four main tables, 29 supplementary tables and Figure 1 to their sources. The README distinguishes extraction from saved models, computation of descriptives, formatting of existing aggregates, and complete model re-estimation. The latter requires authorised access to the specified participant records and model dependencies; it was not repeated for this update. The supplied summary matrices alone cannot reproduce ordinal fitting or grouped cross-validation. Participant-level records, model objects containing those records, individual predictions and partitions are excluded from the public preparation. Synthetic demonstration data do not reproduce the empirical findings. No repository URL, DOI or published release is claimed.</w:t>
+        <w:t xml:space="preserve">Aggregate results, variable dictionaries, R scripts, synthetic demonstration data and documentation/table_map.csv are publicly available at </w:t>
+      </w:r>
+      <w:hyperlink r:id="rId11">
+        <w:r>
+          <w:t>https://github.com/lbenitesanchez/sustainability-values-prosociality</w:t>
+        </w:r>
+      </w:hyperlink>
+      <w:r>
+        <w:t>. The table map links the four main tables, 29 supplementary tables and Figure 1 to their sources. The README distinguishes extraction from saved models, computation of descriptives, formatting of existing aggregates and complete model re-estimation. Complete re-estimation requires authorised access to the specified participant records and private model dependencies; it was not repeated for this update. The supplied summary matrices alone cannot reproduce ordinal fitting or grouped cross-validation. Participant-level records, model objects containing those records, individual predictions and resampling partitions are excluded from the public repository. Synthetic demonstration data do not reproduce the empirical findings.</w:t>
       </w:r>
     </w:p>
     <w:p>

</xml_diff>